<commit_message>
Sync agents, skills, docs: coverage-validator testcase writer pipeline updates
Co-authored-by: Cursor <cursoragent@cursor.com>
</commit_message>
<xml_diff>
--- a/docs/MSC-Dev-Code-and-QA-Test-Coverage-Validator-Directory-Guide.docx
+++ b/docs/MSC-Dev-Code-and-QA-Test-Coverage-Validator-Directory-Guide.docx
@@ -115,41 +115,27 @@
         <w:br/>
         <w:t>│   ├── agents/</w:t>
         <w:br/>
-        <w:t>│   │   └── msc-dev-code-and-qa-test-coverage-validator.md</w:t>
+        <w:t>│   │   ├── msc-dev-code-and-qa-test-coverage-validator.md</w:t>
         <w:br/>
-        <w:t>│   ├── commands/</w:t>
+        <w:t>│   │   ├── msc-testcase-writer.md</w:t>
         <w:br/>
-        <w:t>│   │   └── msc-dev-code-and-qa-test-coverage-validator.md</w:t>
+        <w:t>│   │   └── msc-jira-bug.md</w:t>
         <w:br/>
         <w:t>│   ├── permissions.json               # MCP + terminal allowlist (after install)</w:t>
         <w:br/>
         <w:t>│   └── skills/</w:t>
         <w:br/>
-        <w:t>│       └── msc-dev-code-and-qa-test-coverage-validator/</w:t>
+        <w:t>│       ├── coverage-validator/        # Validator workflow (Steps 0–9)</w:t>
         <w:br/>
-        <w:t>│           ├── SKILL.md               # Primary workflow (Steps 0–9)</w:t>
+        <w:t>│       │   ├── SKILL.md</w:t>
         <w:br/>
-        <w:t>│           ├── report-template.html   # HTML shell with {{PLACEHOLDER}} tokens</w:t>
+        <w:t>│       │   ├── report-template.html</w:t>
         <w:br/>
-        <w:t>│           ├── report-template.md     # Placeholder documentation</w:t>
+        <w:t>│       │   └── references/            # auto-approve, test plan, content-vs-tooltips, …</w:t>
         <w:br/>
-        <w:t>│           ├── examples.md</w:t>
+        <w:t>│       ├── jira-story-testcases/      # QMetry testcase writer</w:t>
         <w:br/>
-        <w:t>│           ├── validator.defaults.example.json</w:t>
-        <w:br/>
-        <w:t>│           └── references/</w:t>
-        <w:br/>
-        <w:t>│               ├── auto-approve-setup.md</w:t>
-        <w:br/>
-        <w:t>│               ├── run-options.md</w:t>
-        <w:br/>
-        <w:t>│               ├── dev-qa-test-scope.md</w:t>
-        <w:br/>
-        <w:t>│               ├── jira-testplan-validation.md</w:t>
-        <w:br/>
-        <w:t>│               ├── confluence-ladr-requirements.md</w:t>
-        <w:br/>
-        <w:t>│               └── github-coverage.md</w:t>
+        <w:t>│       └── bug-filing/                # MSC bug filing (agent: msc-jira-bug)</w:t>
         <w:br/>
         <w:t>├── scripts/                           # Python pipeline (see Section 4)</w:t>
         <w:br/>
@@ -235,7 +221,7 @@
           </w:tcPr>
           <w:p>
             <w:r>
-              <w:t>.cursor/commands/msc-dev-code-and-qa-test-coverage-validator.md</w:t>
+              <w:t>.cursor/agents/msc-dev-code-and-qa-test-coverage-validator.md</w:t>
             </w:r>
           </w:p>
         </w:tc>
@@ -245,7 +231,7 @@
           </w:tcPr>
           <w:p>
             <w:r>
-              <w:t>Slash command definition: pipeline steps 0–11, --auto --write behavior.</w:t>
+              <w:t>Agent: one-shot pipeline, auto-run rules, report builder notes.</w:t>
             </w:r>
           </w:p>
         </w:tc>
@@ -257,7 +243,7 @@
           </w:tcPr>
           <w:p>
             <w:r>
-              <w:t>.cursor/agents/msc-dev-code-and-qa-test-coverage-validator.md</w:t>
+              <w:t>.cursor/agents/msc-testcase-writer.md</w:t>
             </w:r>
           </w:p>
         </w:tc>
@@ -267,7 +253,7 @@
           </w:tcPr>
           <w:p>
             <w:r>
-              <w:t>Subagent definition: auto-run rules, report builder notes, hard rules.</w:t>
+              <w:t>Agent: QMetry Excel via write_testcase_excel.py; LADR-aware drafting.</w:t>
             </w:r>
           </w:p>
         </w:tc>
@@ -279,7 +265,7 @@
           </w:tcPr>
           <w:p>
             <w:r>
-              <w:t>.cursor/skills/.../SKILL.md</w:t>
+              <w:t>.cursor/skills/coverage-validator/SKILL.md</w:t>
             </w:r>
           </w:p>
         </w:tc>
@@ -289,7 +275,7 @@
           </w:tcPr>
           <w:p>
             <w:r>
-              <w:t>Full skill: metrics, workflow, MCP usage, cache paths, HTML placeholders.</w:t>
+              <w:t>Workflow skill: metrics, MCP, caches, HTML placeholders, §8 Dev/QA actions.</w:t>
             </w:r>
           </w:p>
         </w:tc>

</xml_diff>

<commit_message>
Update coverage validator docs: Step 4b fallback, PPT incremental regen.
Refresh Word directory guide and management deck generators; document testplan-missing-fallback, testcase writer flow, and polished-prefix PPT workflow in README files.

Co-authored-by: Cursor <cursoragent@cursor.com>
</commit_message>
<xml_diff>
--- a/docs/MSC-Dev-Code-and-QA-Test-Coverage-Validator-Directory-Guide.docx
+++ b/docs/MSC-Dev-Code-and-QA-Test-Coverage-Validator-Directory-Guide.docx
@@ -139,6 +139,12 @@
         <w:br/>
         <w:t>├── scripts/                           # Python pipeline (see Section 4)</w:t>
         <w:br/>
+        <w:t>├── testcases/                         # QMetry Excel output (testcase writer / fallback)</w:t>
+        <w:br/>
+        <w:t>│   └── &lt;KEY&gt;-testcases.xlsx</w:t>
+        <w:br/>
+        <w:t>├── testplans/                         # Local Domino/SharePoint Excel when referenced_not_local</w:t>
+        <w:br/>
         <w:t>├── docs/</w:t>
         <w:br/>
         <w:t>│   ├── MSC-Dev-Code-and-QA-Test-Coverage-Validator-Jira-Template.docx</w:t>
@@ -163,7 +169,9 @@
         <w:br/>
         <w:t xml:space="preserve">        ├── &lt;KEY&gt;-mapping.json</w:t>
         <w:br/>
-        <w:t xml:space="preserve">        ├── &lt;KEY&gt;-analysis.json      # Optional manual overrides</w:t>
+        <w:t xml:space="preserve">        ├── &lt;KEY&gt;-analysis.json        # Optional manual overrides</w:t>
+        <w:br/>
+        <w:t xml:space="preserve">        ├── &lt;KEY&gt;-testcases-source.tsv # QMetry rows before write_testcase_excel.py</w:t>
         <w:br/>
         <w:t xml:space="preserve">        └── &lt;KEY&gt;-testplan-files/      # Downloaded Excel attachments</w:t>
       </w:r>
@@ -514,7 +522,39 @@
           </w:tcPr>
           <w:p>
             <w:r>
-              <w:t>Download/parse Excel test plan → {KEY}-testplan.json</w:t>
+              <w:t>Download/parse Excel test plan → {KEY}-testplan.json (status: ok | referenced_not_local | no_testplan | parse_failed)</w:t>
+            </w:r>
+          </w:p>
+        </w:tc>
+      </w:tr>
+      <w:tr>
+        <w:tc>
+          <w:tcPr>
+            <w:tcW w:type="dxa" w:w="2880"/>
+          </w:tcPr>
+          <w:p>
+            <w:r>
+              <w:t>4b</w:t>
+            </w:r>
+          </w:p>
+        </w:tc>
+        <w:tc>
+          <w:tcPr>
+            <w:tcW w:type="dxa" w:w="2880"/>
+          </w:tcPr>
+          <w:p>
+            <w:r>
+              <w:t>msc-testcase-writer (agent) + write_testcase_excel.py</w:t>
+            </w:r>
+          </w:p>
+        </w:tc>
+        <w:tc>
+          <w:tcPr>
+            <w:tcW w:type="dxa" w:w="2880"/>
+          </w:tcPr>
+          <w:p>
+            <w:r>
+              <w:t>When testplan status is no_testplan: draft QMetry cases → {KEY}-testcases-source.tsv + testcases/{KEY}-testcases.xlsx; re-run fetch_jira_testplan.py (see references/testplan-missing-fallback.md)</w:t>
             </w:r>
           </w:p>
         </w:tc>
@@ -1120,7 +1160,51 @@
           </w:tcPr>
           <w:p>
             <w:r>
-              <w:t>Optional: upload test plan to Jira</w:t>
+              <w:t>Optional: upload generated testcases/{KEY}-testcases.xlsx to Jira</w:t>
+            </w:r>
+          </w:p>
+        </w:tc>
+      </w:tr>
+      <w:tr>
+        <w:tc>
+          <w:tcPr>
+            <w:tcW w:type="dxa" w:w="4320"/>
+          </w:tcPr>
+          <w:p>
+            <w:r>
+              <w:t>prepare_testcase_writer_context.py</w:t>
+            </w:r>
+          </w:p>
+        </w:tc>
+        <w:tc>
+          <w:tcPr>
+            <w:tcW w:type="dxa" w:w="4320"/>
+          </w:tcPr>
+          <w:p>
+            <w:r>
+              <w:t>Jira + LADR context for msc-testcase-writer (mode: jira_and_ladr vs jira_only)</w:t>
+            </w:r>
+          </w:p>
+        </w:tc>
+      </w:tr>
+      <w:tr>
+        <w:tc>
+          <w:tcPr>
+            <w:tcW w:type="dxa" w:w="4320"/>
+          </w:tcPr>
+          <w:p>
+            <w:r>
+              <w:t>write_testcase_excel.py</w:t>
+            </w:r>
+          </w:p>
+        </w:tc>
+        <w:tc>
+          <w:tcPr>
+            <w:tcW w:type="dxa" w:w="4320"/>
+          </w:tcPr>
+          <w:p>
+            <w:r>
+              <w:t>Cache TSV → testcases/{KEY}-testcases.xlsx (QMetry FF2.0); used by testcase writer and Step 4b fallback</w:t>
             </w:r>
           </w:p>
         </w:tc>
@@ -1439,7 +1523,29 @@
           </w:tcPr>
           <w:p>
             <w:r>
-              <w:t>Excel test plan expectations</w:t>
+              <w:t>Excel test plan expectations; SharePoint/Domino local setup</w:t>
+            </w:r>
+          </w:p>
+        </w:tc>
+      </w:tr>
+      <w:tr>
+        <w:tc>
+          <w:tcPr>
+            <w:tcW w:type="dxa" w:w="4320"/>
+          </w:tcPr>
+          <w:p>
+            <w:r>
+              <w:t>references/testplan-missing-fallback.md</w:t>
+            </w:r>
+          </w:p>
+        </w:tc>
+        <w:tc>
+          <w:tcPr>
+            <w:tcW w:type="dxa" w:w="4320"/>
+          </w:tcPr>
+          <w:p>
+            <w:r>
+              <w:t>Step 4b: when status is no_testplan → msc-testcase-writer + write_testcase_excel.py + re-fetch; generateTestPlanIfMissing / skipTestcaseGeneration flags</w:t>
             </w:r>
           </w:p>
         </w:tc>
@@ -1462,6 +1568,28 @@
           <w:p>
             <w:r>
               <w:t>LADR L1…Ln traceability</w:t>
+            </w:r>
+          </w:p>
+        </w:tc>
+      </w:tr>
+      <w:tr>
+        <w:tc>
+          <w:tcPr>
+            <w:tcW w:type="dxa" w:w="4320"/>
+          </w:tcPr>
+          <w:p>
+            <w:r>
+              <w:t>references/content-vs-tooltips.md</w:t>
+            </w:r>
+          </w:p>
+        </w:tc>
+        <w:tc>
+          <w:tcPr>
+            <w:tcW w:type="dxa" w:w="4320"/>
+          </w:tcPr>
+          <w:p>
+            <w:r>
+              <w:t>Edit §3/§8 data builders only — do not change tooltip HTML/CSS unless UI change requested</w:t>
             </w:r>
           </w:p>
         </w:tc>
@@ -1512,6 +1640,219 @@
       </w:tr>
     </w:tbl>
     <w:p/>
+    <w:p>
+      <w:pPr>
+        <w:pStyle w:val="Heading1"/>
+      </w:pPr>
+      <w:r>
+        <w:t>5.1 Missing Jira test plan — testcase writer fallback (Step 4b)</w:t>
+      </w:r>
+    </w:p>
+    <w:p>
+      <w:r>
+        <w:t>When fetch_jira_testplan.py sets status to no_testplan (no Jira attachment, no comment/SharePoint reference, no existing testcases/{KEY}-testcases.xlsx), the coverage validator agent runs Step 4b per references/testplan-missing-fallback.md. This is agent-orchestrated — not a single Python script.</w:t>
+      </w:r>
+    </w:p>
+    <w:tbl>
+      <w:tblPr>
+        <w:tblStyle w:val="TableGrid"/>
+        <w:tblW w:type="auto" w:w="0"/>
+        <w:tblLook w:firstColumn="1" w:firstRow="1" w:lastColumn="0" w:lastRow="0" w:noHBand="0" w:noVBand="1" w:val="04A0"/>
+      </w:tblPr>
+      <w:tblGrid>
+        <w:gridCol w:w="4320"/>
+        <w:gridCol w:w="4320"/>
+      </w:tblGrid>
+      <w:tr>
+        <w:tc>
+          <w:tcPr>
+            <w:tcW w:type="dxa" w:w="4320"/>
+          </w:tcPr>
+          <w:p>
+            <w:r>
+              <w:rPr>
+                <w:b/>
+              </w:rPr>
+              <w:t>testplan.json status</w:t>
+            </w:r>
+          </w:p>
+        </w:tc>
+        <w:tc>
+          <w:tcPr>
+            <w:tcW w:type="dxa" w:w="4320"/>
+          </w:tcPr>
+          <w:p>
+            <w:r>
+              <w:rPr>
+                <w:b/>
+              </w:rPr>
+              <w:t>Action</w:t>
+            </w:r>
+          </w:p>
+        </w:tc>
+      </w:tr>
+      <w:tr>
+        <w:tc>
+          <w:tcPr>
+            <w:tcW w:type="dxa" w:w="4320"/>
+          </w:tcPr>
+          <w:p>
+            <w:r>
+              <w:t>ok</w:t>
+            </w:r>
+          </w:p>
+        </w:tc>
+        <w:tc>
+          <w:tcPr>
+            <w:tcW w:type="dxa" w:w="4320"/>
+          </w:tcPr>
+          <w:p>
+            <w:r>
+              <w:t>Continue pipeline — test cases parsed from Jira attachment, testplans/, or testcases/</w:t>
+            </w:r>
+          </w:p>
+        </w:tc>
+      </w:tr>
+      <w:tr>
+        <w:tc>
+          <w:tcPr>
+            <w:tcW w:type="dxa" w:w="4320"/>
+          </w:tcPr>
+          <w:p>
+            <w:r>
+              <w:t>referenced_not_local</w:t>
+            </w:r>
+          </w:p>
+        </w:tc>
+        <w:tc>
+          <w:tcPr>
+            <w:tcW w:type="dxa" w:w="4320"/>
+          </w:tcPr>
+          <w:p>
+            <w:r>
+              <w:t>Do not invoke testcase writer — place referenced Excel under testplans/ and re-run fetch_jira_testplan.py</w:t>
+            </w:r>
+          </w:p>
+        </w:tc>
+      </w:tr>
+      <w:tr>
+        <w:tc>
+          <w:tcPr>
+            <w:tcW w:type="dxa" w:w="4320"/>
+          </w:tcPr>
+          <w:p>
+            <w:r>
+              <w:t>parse_failed</w:t>
+            </w:r>
+          </w:p>
+        </w:tc>
+        <w:tc>
+          <w:tcPr>
+            <w:tcW w:type="dxa" w:w="4320"/>
+          </w:tcPr>
+          <w:p>
+            <w:r>
+              <w:t>Fix local file; generate only if user asks</w:t>
+            </w:r>
+          </w:p>
+        </w:tc>
+      </w:tr>
+      <w:tr>
+        <w:tc>
+          <w:tcPr>
+            <w:tcW w:type="dxa" w:w="4320"/>
+          </w:tcPr>
+          <w:p>
+            <w:r>
+              <w:t>no_testplan</w:t>
+            </w:r>
+          </w:p>
+        </w:tc>
+        <w:tc>
+          <w:tcPr>
+            <w:tcW w:type="dxa" w:w="4320"/>
+          </w:tcPr>
+          <w:p>
+            <w:r>
+              <w:t>If generateTestPlanIfMissing is true (default in --auto --write): invoke /msc-testcase-writer {KEY}, write reports/.cache/{KEY}-testcases-source.tsv, run write_testcase_excel.py, re-fetch test plan</w:t>
+            </w:r>
+          </w:p>
+        </w:tc>
+      </w:tr>
+    </w:tbl>
+    <w:p/>
+    <w:p>
+      <w:pPr>
+        <w:pStyle w:val="ListBullet"/>
+      </w:pPr>
+      <w:r>
+        <w:rPr>
+          <w:b/>
+        </w:rPr>
+        <w:t>Opt out</w:t>
+      </w:r>
+      <w:r>
+        <w:t xml:space="preserve"> — set skipTestcaseGeneration: true in manifest or .coverage-validator.defaults.json</w:t>
+      </w:r>
+    </w:p>
+    <w:p>
+      <w:pPr>
+        <w:pStyle w:val="ListBullet"/>
+      </w:pPr>
+      <w:r>
+        <w:rPr>
+          <w:b/>
+        </w:rPr>
+        <w:t>After fallback</w:t>
+      </w:r>
+      <w:r>
+        <w:t xml:space="preserve"> — testPlanSource: workspace_generated; §3 note states locally generated via msc-testcase-writer</w:t>
+      </w:r>
+    </w:p>
+    <w:p>
+      <w:pPr>
+        <w:pStyle w:val="ListBullet"/>
+      </w:pPr>
+      <w:r>
+        <w:rPr>
+          <w:b/>
+        </w:rPr>
+        <w:t>Report honesty</w:t>
+      </w:r>
+      <w:r>
+        <w:t xml:space="preserve"> — Evidence column shows No execution evidence (not Mascot/SIT job IDs)</w:t>
+      </w:r>
+    </w:p>
+    <w:p>
+      <w:pPr>
+        <w:ind w:left="288"/>
+      </w:pPr>
+      <w:r>
+        <w:rPr>
+          <w:rFonts w:ascii="Consolas" w:hAnsi="Consolas"/>
+          <w:sz w:val="18"/>
+        </w:rPr>
+        <w:t># Step 4b sequence (no_testplan + --auto --write)</w:t>
+        <w:br/>
+        <w:t>python scripts/fetch_jira_testplan.py MSC-209330 --from-jira-cache   # status: no_testplan</w:t>
+        <w:br/>
+        <w:t># → agent: /msc-testcase-writer MSC-209330</w:t>
+        <w:br/>
+        <w:t>python scripts/prepare_testcase_writer_context.py MSC-209330 --from-jira-cache</w:t>
+        <w:br/>
+        <w:t># → reports/.cache/MSC-209330-testcases-source.tsv (agent draft)</w:t>
+        <w:br/>
+        <w:t>python scripts/write_testcase_excel.py MSC-209330</w:t>
+        <w:br/>
+        <w:t># → testcases/MSC-209330-testcases.xlsx</w:t>
+        <w:br/>
+        <w:t>python scripts/fetch_jira_testplan.py MSC-209330 --from-jira-cache   # status: ok, workspace_generated</w:t>
+        <w:br/>
+        <w:t>python scripts/map_requirements_to_diff.py MSC-209330</w:t>
+        <w:br/>
+        <w:t>python scripts/build_coverage_report.py MSC-209330</w:t>
+      </w:r>
+    </w:p>
     <w:p>
       <w:pPr>
         <w:pStyle w:val="Heading1"/>
@@ -1727,7 +2068,71 @@
           </w:tcPr>
           <w:p>
             <w:r>
-              <w:t>Parsed test cases, GWT, Jira/LADR mapping</w:t>
+              <w:t>Parsed test cases, GWT, Jira/LADR mapping; status field drives Step 4b fallback</w:t>
+            </w:r>
+          </w:p>
+        </w:tc>
+      </w:tr>
+      <w:tr>
+        <w:tc>
+          <w:tcPr>
+            <w:tcW w:type="dxa" w:w="2880"/>
+          </w:tcPr>
+          <w:p>
+            <w:r>
+              <w:t>reports/.cache/{KEY}-testcases-source.tsv</w:t>
+            </w:r>
+          </w:p>
+        </w:tc>
+        <w:tc>
+          <w:tcPr>
+            <w:tcW w:type="dxa" w:w="2880"/>
+          </w:tcPr>
+          <w:p>
+            <w:r>
+              <w:t>msc-testcase-writer (agent)</w:t>
+            </w:r>
+          </w:p>
+        </w:tc>
+        <w:tc>
+          <w:tcPr>
+            <w:tcW w:type="dxa" w:w="2880"/>
+          </w:tcPr>
+          <w:p>
+            <w:r>
+              <w:t>QMetry row draft before write_testcase_excel.py (not stored in testcases/)</w:t>
+            </w:r>
+          </w:p>
+        </w:tc>
+      </w:tr>
+      <w:tr>
+        <w:tc>
+          <w:tcPr>
+            <w:tcW w:type="dxa" w:w="2880"/>
+          </w:tcPr>
+          <w:p>
+            <w:r>
+              <w:t>testcases/{KEY}-testcases.xlsx</w:t>
+            </w:r>
+          </w:p>
+        </w:tc>
+        <w:tc>
+          <w:tcPr>
+            <w:tcW w:type="dxa" w:w="2880"/>
+          </w:tcPr>
+          <w:p>
+            <w:r>
+              <w:t>write_testcase_excel.py</w:t>
+            </w:r>
+          </w:p>
+        </w:tc>
+        <w:tc>
+          <w:tcPr>
+            <w:tcW w:type="dxa" w:w="2880"/>
+          </w:tcPr>
+          <w:p>
+            <w:r>
+              <w:t>Local QMetry plan; fetch_jira_testplan.py source priority #4; workspace_generated in report</w:t>
             </w:r>
           </w:p>
         </w:tc>
@@ -1900,21 +2305,31 @@
         <w:t>/msc-dev-code-and-qa-test-coverage-validator MSC-205625</w:t>
         <w:br/>
         <w:br/>
-        <w:t xml:space="preserve">  MCP (parallel)     →  reports/.cache/MSC-205625-jira.json</w:t>
+        <w:t xml:space="preserve">  MCP (parallel)       →  reports/.cache/MSC-205625-jira.json</w:t>
         <w:br/>
-        <w:t xml:space="preserve">  fetch_confluence   →  reports/.cache/MSC-205625-confluence.json</w:t>
+        <w:t xml:space="preserve">  fetch_confluence     →  reports/.cache/MSC-205625-confluence.json</w:t>
         <w:br/>
-        <w:t xml:space="preserve">  fetch_jira_testplan→  reports/.cache/MSC-205625-testplan.json</w:t>
+        <w:t xml:space="preserve">  fetch_jira_testplan  →  reports/.cache/MSC-205625-testplan.json</w:t>
         <w:br/>
-        <w:t xml:space="preserve">  prefetch / gh      →  reports/.cache/MSC-205625-prefetch.json</w:t>
+        <w:t xml:space="preserve">  [Step 4b if no_testplan]</w:t>
         <w:br/>
-        <w:t xml:space="preserve">  map_requirements   →  reports/.cache/MSC-205625-mapping.json</w:t>
+        <w:t xml:space="preserve">    msc-testcase-writer + write_testcase_excel.py</w:t>
+        <w:br/>
+        <w:t xml:space="preserve">                       →  testcases/MSC-205625-testcases.xlsx</w:t>
+        <w:br/>
+        <w:t xml:space="preserve">                       →  re-fetch testplan (status: ok, workspace_generated)</w:t>
+        <w:br/>
+        <w:t xml:space="preserve">                       (see references/testplan-missing-fallback.md)</w:t>
+        <w:br/>
+        <w:t xml:space="preserve">  prefetch / gh        →  reports/.cache/MSC-205625-prefetch.json</w:t>
+        <w:br/>
+        <w:t xml:space="preserve">  map_requirements     →  reports/.cache/MSC-205625-mapping.json</w:t>
         <w:br/>
         <w:t xml:space="preserve">  build_coverage_report</w:t>
         <w:br/>
-        <w:t xml:space="preserve">                     →  reports/MSC-205625-&lt;timestamp&gt;-IST.html</w:t>
+        <w:t xml:space="preserve">                       →  reports/MSC-205625-&lt;timestamp&gt;-IST.html</w:t>
         <w:br/>
-        <w:t xml:space="preserve">                     →  manifest lastReportFile updated</w:t>
+        <w:t xml:space="preserve">                       →  manifest lastReportFile updated</w:t>
       </w:r>
     </w:p>
     <w:p>

</xml_diff>